<commit_message>
Add word-by-word alert breakdown to Arabic bot guide
Appends an appendix dissecting two real WATCH alerts (NASDAQ + DOW)
term by term: every line, number, indicator, and exit-plan field
explained in Arabic tables.

Co-Authored-By: Claude Opus 4.8 <noreply@anthropic.com>
Claude-Session: https://claude.ai/code/session_018XBM1ALAG74HZtemF4atYg
</commit_message>
<xml_diff>
--- a/دليل_رسائل_البوت.docx
+++ b/دليل_رسائل_البوت.docx
@@ -965,6 +965,2013 @@
         <w:t>القاعدة: الصمت يعني عدم وجود فرص جيدة، وليس عطلاً. للتأكد أن البوت حي، انظر إلى evaluated في الملخص اليومي أو إلى لوحة المتابعة (dashboard).</w:t>
       </w:r>
     </w:p>
+    <w:p>
+      <w:r>
+        <w:br w:type="page"/>
+      </w:r>
+    </w:p>
+    <w:p>
+      <w:pPr>
+        <w:pStyle w:val="Heading1"/>
+        <w:bidi/>
+        <w:jc w:val="right"/>
+      </w:pPr>
+      <w:r>
+        <w:rPr>
+          <w:rFonts w:ascii="Arial" w:hAnsi="Arial"/>
+          <w:color w:val="C05000"/>
+          <w:rtl/>
+        </w:rPr>
+        <w:t>ملحق: تشريح تنبيه حقيقي كلمة بكلمة</w:t>
+      </w:r>
+    </w:p>
+    <w:p>
+      <w:pPr>
+        <w:bidi/>
+        <w:jc w:val="right"/>
+      </w:pPr>
+      <w:r>
+        <w:rPr>
+          <w:rFonts w:ascii="Arial" w:hAnsi="Arial"/>
+          <w:b w:val="0"/>
+          <w:sz w:val="24"/>
+          <w:rtl/>
+        </w:rPr>
+        <w:t>في هذا الملحق نأخذ تنبيهين حقيقيين ونشرح كل كلمة ورقم فيهما.</w:t>
+      </w:r>
+    </w:p>
+    <w:p>
+      <w:pPr>
+        <w:pStyle w:val="Heading2"/>
+        <w:bidi/>
+        <w:jc w:val="right"/>
+      </w:pPr>
+      <w:r>
+        <w:rPr>
+          <w:rFonts w:ascii="Arial" w:hAnsi="Arial"/>
+          <w:color w:val="1F4E79"/>
+          <w:rtl/>
+        </w:rPr>
+        <w:t>المثال الأول — NASDAQ (US100)</w:t>
+      </w:r>
+    </w:p>
+    <w:p>
+      <w:pPr>
+        <w:jc w:val="left"/>
+        <w:shd w:fill="F2F2F2"/>
+      </w:pPr>
+      <w:r>
+        <w:rPr>
+          <w:rFonts w:ascii="Consolas" w:hAnsi="Consolas"/>
+          <w:color w:val="333333"/>
+          <w:sz w:val="19"/>
+        </w:rPr>
+        <w:t>[WATCH (heads-up only)] LONG NASDAQ (US100) — score 74/100</w:t>
+        <w:br/>
+        <w:t>Strategy 1: Supply Zone Rejection</w:t>
+        <w:br/>
+        <w:br/>
+        <w:t>Entry  29298.20  (LIMIT pullback — never chase)</w:t>
+        <w:br/>
+        <w:t>Stop   29180.46  (117.74pts = 1.1x ATR15)</w:t>
+        <w:br/>
+        <w:br/>
+        <w:t>EXIT PLAN:</w:t>
+        <w:br/>
+        <w:t xml:space="preserve">  TP1  29533.67  (50%, move stop to BE 29298.20)</w:t>
+        <w:br/>
+        <w:t xml:space="preserve">  TP2  29651.41  (trail: Chandelier 2.5x ATR)</w:t>
+        <w:br/>
+        <w:t xml:space="preserve">  Time: If flat after 18:38 UTC (22:38 Dubai), close</w:t>
+        <w:br/>
+        <w:br/>
+        <w:t>Size: 0 lots US100 — 1 lot risks $118 &gt; $50 budget.</w:t>
+        <w:br/>
+        <w:t>FLAT BY 19:38 UTC (23:38 Dubai)</w:t>
+        <w:br/>
+        <w:br/>
+        <w:t>Why: rejected H1 demand zone 29206-29325; indicators</w:t>
+        <w:br/>
+        <w:t>aligned (3/3: RSI 61, MACD up, &gt;EMA20); HTF bias bull; NY session</w:t>
+      </w:r>
+    </w:p>
+    <w:p>
+      <w:pPr>
+        <w:bidi/>
+        <w:jc w:val="right"/>
+      </w:pPr>
+      <w:r>
+        <w:rPr>
+          <w:rFonts w:ascii="Arial" w:hAnsi="Arial"/>
+          <w:b/>
+          <w:sz w:val="24"/>
+          <w:rtl/>
+        </w:rPr>
+        <w:t>السطر الأول:</w:t>
+      </w:r>
+    </w:p>
+    <w:tbl>
+      <w:tblPr>
+        <w:tblStyle w:val="LightGrid-Accent1"/>
+        <w:tblW w:type="auto" w:w="0"/>
+        <w:jc w:val="right"/>
+        <w:tblLook w:firstColumn="1" w:firstRow="1" w:lastColumn="0" w:lastRow="0" w:noHBand="0" w:noVBand="1" w:val="04A0"/>
+      </w:tblPr>
+      <w:tblGrid>
+        <w:gridCol w:w="4320"/>
+        <w:gridCol w:w="4320"/>
+      </w:tblGrid>
+      <w:tr>
+        <w:tc>
+          <w:tcPr>
+            <w:tcW w:type="dxa" w:w="4320"/>
+          </w:tcPr>
+          <w:p>
+            <w:pPr>
+              <w:bidi/>
+              <w:jc w:val="right"/>
+            </w:pPr>
+            <w:r>
+              <w:rPr>
+                <w:rFonts w:ascii="Arial" w:hAnsi="Arial"/>
+                <w:b/>
+                <w:rtl/>
+              </w:rPr>
+              <w:t>المعنى</w:t>
+            </w:r>
+          </w:p>
+        </w:tc>
+        <w:tc>
+          <w:tcPr>
+            <w:tcW w:type="dxa" w:w="4320"/>
+          </w:tcPr>
+          <w:p>
+            <w:pPr>
+              <w:bidi/>
+              <w:jc w:val="right"/>
+            </w:pPr>
+            <w:r>
+              <w:rPr>
+                <w:rFonts w:ascii="Arial" w:hAnsi="Arial"/>
+                <w:b/>
+                <w:rtl/>
+              </w:rPr>
+              <w:t>الكلمة / الرقم</w:t>
+            </w:r>
+          </w:p>
+        </w:tc>
+      </w:tr>
+      <w:tr>
+        <w:tc>
+          <w:tcPr>
+            <w:tcW w:type="dxa" w:w="4320"/>
+          </w:tcPr>
+          <w:p>
+            <w:pPr>
+              <w:bidi/>
+              <w:jc w:val="right"/>
+            </w:pPr>
+            <w:r>
+              <w:rPr>
+                <w:rFonts w:ascii="Arial" w:hAnsi="Arial"/>
+                <w:rtl/>
+              </w:rPr>
+              <w:t>تنبيه مراقبة فقط — للانتباه لا للتنفيذ المباشر (التقييم أقل من عتبة A+).</w:t>
+            </w:r>
+          </w:p>
+        </w:tc>
+        <w:tc>
+          <w:tcPr>
+            <w:tcW w:type="dxa" w:w="4320"/>
+          </w:tcPr>
+          <w:p>
+            <w:pPr>
+              <w:jc w:val="left"/>
+            </w:pPr>
+            <w:r>
+              <w:rPr>
+                <w:rFonts w:ascii="Consolas" w:hAnsi="Consolas"/>
+                <w:b/>
+                <w:sz w:val="20"/>
+              </w:rPr>
+              <w:t>WATCH (heads-up only)</w:t>
+            </w:r>
+          </w:p>
+        </w:tc>
+      </w:tr>
+      <w:tr>
+        <w:tc>
+          <w:tcPr>
+            <w:tcW w:type="dxa" w:w="4320"/>
+          </w:tcPr>
+          <w:p>
+            <w:pPr>
+              <w:bidi/>
+              <w:jc w:val="right"/>
+            </w:pPr>
+            <w:r>
+              <w:rPr>
+                <w:rFonts w:ascii="Arial" w:hAnsi="Arial"/>
+                <w:rtl/>
+              </w:rPr>
+              <w:t>اتجاه الصفقة = شراء (تتوقّع صعود السعر).</w:t>
+            </w:r>
+          </w:p>
+        </w:tc>
+        <w:tc>
+          <w:tcPr>
+            <w:tcW w:type="dxa" w:w="4320"/>
+          </w:tcPr>
+          <w:p>
+            <w:pPr>
+              <w:jc w:val="left"/>
+            </w:pPr>
+            <w:r>
+              <w:rPr>
+                <w:rFonts w:ascii="Consolas" w:hAnsi="Consolas"/>
+                <w:b/>
+                <w:sz w:val="20"/>
+              </w:rPr>
+              <w:t>LONG</w:t>
+            </w:r>
+          </w:p>
+        </w:tc>
+      </w:tr>
+      <w:tr>
+        <w:tc>
+          <w:tcPr>
+            <w:tcW w:type="dxa" w:w="4320"/>
+          </w:tcPr>
+          <w:p>
+            <w:pPr>
+              <w:bidi/>
+              <w:jc w:val="right"/>
+            </w:pPr>
+            <w:r>
+              <w:rPr>
+                <w:rFonts w:ascii="Arial" w:hAnsi="Arial"/>
+                <w:rtl/>
+              </w:rPr>
+              <w:t>الأداة = مؤشر ناسداك 100، رمزه عند الوسيط US100.</w:t>
+            </w:r>
+          </w:p>
+        </w:tc>
+        <w:tc>
+          <w:tcPr>
+            <w:tcW w:type="dxa" w:w="4320"/>
+          </w:tcPr>
+          <w:p>
+            <w:pPr>
+              <w:jc w:val="left"/>
+            </w:pPr>
+            <w:r>
+              <w:rPr>
+                <w:rFonts w:ascii="Consolas" w:hAnsi="Consolas"/>
+                <w:b/>
+                <w:sz w:val="20"/>
+              </w:rPr>
+              <w:t>NASDAQ (US100)</w:t>
+            </w:r>
+          </w:p>
+        </w:tc>
+      </w:tr>
+      <w:tr>
+        <w:tc>
+          <w:tcPr>
+            <w:tcW w:type="dxa" w:w="4320"/>
+          </w:tcPr>
+          <w:p>
+            <w:pPr>
+              <w:bidi/>
+              <w:jc w:val="right"/>
+            </w:pPr>
+            <w:r>
+              <w:rPr>
+                <w:rFonts w:ascii="Arial" w:hAnsi="Arial"/>
+                <w:rtl/>
+              </w:rPr>
+              <w:t>قوة الإعداد = 74 من 100. (62–74 = WATCH، ≥75 = A+).</w:t>
+            </w:r>
+          </w:p>
+        </w:tc>
+        <w:tc>
+          <w:tcPr>
+            <w:tcW w:type="dxa" w:w="4320"/>
+          </w:tcPr>
+          <w:p>
+            <w:pPr>
+              <w:jc w:val="left"/>
+            </w:pPr>
+            <w:r>
+              <w:rPr>
+                <w:rFonts w:ascii="Consolas" w:hAnsi="Consolas"/>
+                <w:b/>
+                <w:sz w:val="20"/>
+              </w:rPr>
+              <w:t>score 74/100</w:t>
+            </w:r>
+          </w:p>
+        </w:tc>
+      </w:tr>
+      <w:tr>
+        <w:tc>
+          <w:tcPr>
+            <w:tcW w:type="dxa" w:w="4320"/>
+          </w:tcPr>
+          <w:p>
+            <w:pPr>
+              <w:bidi/>
+              <w:jc w:val="right"/>
+            </w:pPr>
+            <w:r>
+              <w:rPr>
+                <w:rFonts w:ascii="Arial" w:hAnsi="Arial"/>
+                <w:rtl/>
+              </w:rPr>
+              <w:t>الاستراتيجية التي أطلقت الإشارة = ارتداد من منطقة عرض/طلب.</w:t>
+            </w:r>
+          </w:p>
+        </w:tc>
+        <w:tc>
+          <w:tcPr>
+            <w:tcW w:type="dxa" w:w="4320"/>
+          </w:tcPr>
+          <w:p>
+            <w:pPr>
+              <w:jc w:val="left"/>
+            </w:pPr>
+            <w:r>
+              <w:rPr>
+                <w:rFonts w:ascii="Consolas" w:hAnsi="Consolas"/>
+                <w:b/>
+                <w:sz w:val="20"/>
+              </w:rPr>
+              <w:t>Strategy 1: Supply Zone Rejection</w:t>
+            </w:r>
+          </w:p>
+        </w:tc>
+      </w:tr>
+    </w:tbl>
+    <w:p>
+      <w:pPr>
+        <w:bidi/>
+        <w:jc w:val="right"/>
+      </w:pPr>
+      <w:r>
+        <w:rPr>
+          <w:rFonts w:ascii="Arial" w:hAnsi="Arial"/>
+          <w:b/>
+          <w:sz w:val="24"/>
+          <w:rtl/>
+        </w:rPr>
+        <w:t>الدخول والوقف:</w:t>
+      </w:r>
+    </w:p>
+    <w:tbl>
+      <w:tblPr>
+        <w:tblStyle w:val="LightGrid-Accent1"/>
+        <w:tblW w:type="auto" w:w="0"/>
+        <w:jc w:val="right"/>
+        <w:tblLook w:firstColumn="1" w:firstRow="1" w:lastColumn="0" w:lastRow="0" w:noHBand="0" w:noVBand="1" w:val="04A0"/>
+      </w:tblPr>
+      <w:tblGrid>
+        <w:gridCol w:w="4320"/>
+        <w:gridCol w:w="4320"/>
+      </w:tblGrid>
+      <w:tr>
+        <w:tc>
+          <w:tcPr>
+            <w:tcW w:type="dxa" w:w="4320"/>
+          </w:tcPr>
+          <w:p>
+            <w:pPr>
+              <w:bidi/>
+              <w:jc w:val="right"/>
+            </w:pPr>
+            <w:r>
+              <w:rPr>
+                <w:rFonts w:ascii="Arial" w:hAnsi="Arial"/>
+                <w:b/>
+                <w:rtl/>
+              </w:rPr>
+              <w:t>المعنى</w:t>
+            </w:r>
+          </w:p>
+        </w:tc>
+        <w:tc>
+          <w:tcPr>
+            <w:tcW w:type="dxa" w:w="4320"/>
+          </w:tcPr>
+          <w:p>
+            <w:pPr>
+              <w:bidi/>
+              <w:jc w:val="right"/>
+            </w:pPr>
+            <w:r>
+              <w:rPr>
+                <w:rFonts w:ascii="Arial" w:hAnsi="Arial"/>
+                <w:b/>
+                <w:rtl/>
+              </w:rPr>
+              <w:t>الكلمة / الرقم</w:t>
+            </w:r>
+          </w:p>
+        </w:tc>
+      </w:tr>
+      <w:tr>
+        <w:tc>
+          <w:tcPr>
+            <w:tcW w:type="dxa" w:w="4320"/>
+          </w:tcPr>
+          <w:p>
+            <w:pPr>
+              <w:bidi/>
+              <w:jc w:val="right"/>
+            </w:pPr>
+            <w:r>
+              <w:rPr>
+                <w:rFonts w:ascii="Arial" w:hAnsi="Arial"/>
+                <w:rtl/>
+              </w:rPr>
+              <w:t>سعر الدخول المقترح.</w:t>
+            </w:r>
+          </w:p>
+        </w:tc>
+        <w:tc>
+          <w:tcPr>
+            <w:tcW w:type="dxa" w:w="4320"/>
+          </w:tcPr>
+          <w:p>
+            <w:pPr>
+              <w:jc w:val="left"/>
+            </w:pPr>
+            <w:r>
+              <w:rPr>
+                <w:rFonts w:ascii="Consolas" w:hAnsi="Consolas"/>
+                <w:b/>
+                <w:sz w:val="20"/>
+              </w:rPr>
+              <w:t>Entry 29298.20</w:t>
+            </w:r>
+          </w:p>
+        </w:tc>
+      </w:tr>
+      <w:tr>
+        <w:tc>
+          <w:tcPr>
+            <w:tcW w:type="dxa" w:w="4320"/>
+          </w:tcPr>
+          <w:p>
+            <w:pPr>
+              <w:bidi/>
+              <w:jc w:val="right"/>
+            </w:pPr>
+            <w:r>
+              <w:rPr>
+                <w:rFonts w:ascii="Arial" w:hAnsi="Arial"/>
+                <w:rtl/>
+              </w:rPr>
+              <w:t>ادخل بأمر معلّق عند ارتداد السعر لهذا المستوى — لا بسعر السوق.</w:t>
+            </w:r>
+          </w:p>
+        </w:tc>
+        <w:tc>
+          <w:tcPr>
+            <w:tcW w:type="dxa" w:w="4320"/>
+          </w:tcPr>
+          <w:p>
+            <w:pPr>
+              <w:jc w:val="left"/>
+            </w:pPr>
+            <w:r>
+              <w:rPr>
+                <w:rFonts w:ascii="Consolas" w:hAnsi="Consolas"/>
+                <w:b/>
+                <w:sz w:val="20"/>
+              </w:rPr>
+              <w:t>LIMIT pullback</w:t>
+            </w:r>
+          </w:p>
+        </w:tc>
+      </w:tr>
+      <w:tr>
+        <w:tc>
+          <w:tcPr>
+            <w:tcW w:type="dxa" w:w="4320"/>
+          </w:tcPr>
+          <w:p>
+            <w:pPr>
+              <w:bidi/>
+              <w:jc w:val="right"/>
+            </w:pPr>
+            <w:r>
+              <w:rPr>
+                <w:rFonts w:ascii="Arial" w:hAnsi="Arial"/>
+                <w:rtl/>
+              </w:rPr>
+              <w:t>لا تطارد السعر إن صعد بدونك؛ انتظر عودته أو تجاهل الصفقة.</w:t>
+            </w:r>
+          </w:p>
+        </w:tc>
+        <w:tc>
+          <w:tcPr>
+            <w:tcW w:type="dxa" w:w="4320"/>
+          </w:tcPr>
+          <w:p>
+            <w:pPr>
+              <w:jc w:val="left"/>
+            </w:pPr>
+            <w:r>
+              <w:rPr>
+                <w:rFonts w:ascii="Consolas" w:hAnsi="Consolas"/>
+                <w:b/>
+                <w:sz w:val="20"/>
+              </w:rPr>
+              <w:t>never chase</w:t>
+            </w:r>
+          </w:p>
+        </w:tc>
+      </w:tr>
+      <w:tr>
+        <w:tc>
+          <w:tcPr>
+            <w:tcW w:type="dxa" w:w="4320"/>
+          </w:tcPr>
+          <w:p>
+            <w:pPr>
+              <w:bidi/>
+              <w:jc w:val="right"/>
+            </w:pPr>
+            <w:r>
+              <w:rPr>
+                <w:rFonts w:ascii="Arial" w:hAnsi="Arial"/>
+                <w:rtl/>
+              </w:rPr>
+              <w:t>وقف الخسارة.</w:t>
+            </w:r>
+          </w:p>
+        </w:tc>
+        <w:tc>
+          <w:tcPr>
+            <w:tcW w:type="dxa" w:w="4320"/>
+          </w:tcPr>
+          <w:p>
+            <w:pPr>
+              <w:jc w:val="left"/>
+            </w:pPr>
+            <w:r>
+              <w:rPr>
+                <w:rFonts w:ascii="Consolas" w:hAnsi="Consolas"/>
+                <w:b/>
+                <w:sz w:val="20"/>
+              </w:rPr>
+              <w:t>Stop 29180.46</w:t>
+            </w:r>
+          </w:p>
+        </w:tc>
+      </w:tr>
+      <w:tr>
+        <w:tc>
+          <w:tcPr>
+            <w:tcW w:type="dxa" w:w="4320"/>
+          </w:tcPr>
+          <w:p>
+            <w:pPr>
+              <w:bidi/>
+              <w:jc w:val="right"/>
+            </w:pPr>
+            <w:r>
+              <w:rPr>
+                <w:rFonts w:ascii="Arial" w:hAnsi="Arial"/>
+                <w:rtl/>
+              </w:rPr>
+              <w:t>المسافة بين الدخول والوقف = 117.74 نقطة.</w:t>
+            </w:r>
+          </w:p>
+        </w:tc>
+        <w:tc>
+          <w:tcPr>
+            <w:tcW w:type="dxa" w:w="4320"/>
+          </w:tcPr>
+          <w:p>
+            <w:pPr>
+              <w:jc w:val="left"/>
+            </w:pPr>
+            <w:r>
+              <w:rPr>
+                <w:rFonts w:ascii="Consolas" w:hAnsi="Consolas"/>
+                <w:b/>
+                <w:sz w:val="20"/>
+              </w:rPr>
+              <w:t>117.74pts</w:t>
+            </w:r>
+          </w:p>
+        </w:tc>
+      </w:tr>
+      <w:tr>
+        <w:tc>
+          <w:tcPr>
+            <w:tcW w:type="dxa" w:w="4320"/>
+          </w:tcPr>
+          <w:p>
+            <w:pPr>
+              <w:bidi/>
+              <w:jc w:val="right"/>
+            </w:pPr>
+            <w:r>
+              <w:rPr>
+                <w:rFonts w:ascii="Arial" w:hAnsi="Arial"/>
+                <w:rtl/>
+              </w:rPr>
+              <w:t>هذه المسافة = 1.1 ضعف متوسط التقلّب ATR على فريم 15 دقيقة.</w:t>
+            </w:r>
+          </w:p>
+        </w:tc>
+        <w:tc>
+          <w:tcPr>
+            <w:tcW w:type="dxa" w:w="4320"/>
+          </w:tcPr>
+          <w:p>
+            <w:pPr>
+              <w:jc w:val="left"/>
+            </w:pPr>
+            <w:r>
+              <w:rPr>
+                <w:rFonts w:ascii="Consolas" w:hAnsi="Consolas"/>
+                <w:b/>
+                <w:sz w:val="20"/>
+              </w:rPr>
+              <w:t>1.1x ATR15</w:t>
+            </w:r>
+          </w:p>
+        </w:tc>
+      </w:tr>
+    </w:tbl>
+    <w:p>
+      <w:pPr>
+        <w:bidi/>
+        <w:jc w:val="right"/>
+      </w:pPr>
+      <w:r>
+        <w:rPr>
+          <w:rFonts w:ascii="Arial" w:hAnsi="Arial"/>
+          <w:b/>
+          <w:sz w:val="24"/>
+          <w:rtl/>
+        </w:rPr>
+        <w:t>خطة الخروج:</w:t>
+      </w:r>
+    </w:p>
+    <w:tbl>
+      <w:tblPr>
+        <w:tblStyle w:val="LightGrid-Accent1"/>
+        <w:tblW w:type="auto" w:w="0"/>
+        <w:jc w:val="right"/>
+        <w:tblLook w:firstColumn="1" w:firstRow="1" w:lastColumn="0" w:lastRow="0" w:noHBand="0" w:noVBand="1" w:val="04A0"/>
+      </w:tblPr>
+      <w:tblGrid>
+        <w:gridCol w:w="4320"/>
+        <w:gridCol w:w="4320"/>
+      </w:tblGrid>
+      <w:tr>
+        <w:tc>
+          <w:tcPr>
+            <w:tcW w:type="dxa" w:w="4320"/>
+          </w:tcPr>
+          <w:p>
+            <w:pPr>
+              <w:bidi/>
+              <w:jc w:val="right"/>
+            </w:pPr>
+            <w:r>
+              <w:rPr>
+                <w:rFonts w:ascii="Arial" w:hAnsi="Arial"/>
+                <w:b/>
+                <w:rtl/>
+              </w:rPr>
+              <w:t>المعنى</w:t>
+            </w:r>
+          </w:p>
+        </w:tc>
+        <w:tc>
+          <w:tcPr>
+            <w:tcW w:type="dxa" w:w="4320"/>
+          </w:tcPr>
+          <w:p>
+            <w:pPr>
+              <w:bidi/>
+              <w:jc w:val="right"/>
+            </w:pPr>
+            <w:r>
+              <w:rPr>
+                <w:rFonts w:ascii="Arial" w:hAnsi="Arial"/>
+                <w:b/>
+                <w:rtl/>
+              </w:rPr>
+              <w:t>الكلمة / الرقم</w:t>
+            </w:r>
+          </w:p>
+        </w:tc>
+      </w:tr>
+      <w:tr>
+        <w:tc>
+          <w:tcPr>
+            <w:tcW w:type="dxa" w:w="4320"/>
+          </w:tcPr>
+          <w:p>
+            <w:pPr>
+              <w:bidi/>
+              <w:jc w:val="right"/>
+            </w:pPr>
+            <w:r>
+              <w:rPr>
+                <w:rFonts w:ascii="Arial" w:hAnsi="Arial"/>
+                <w:rtl/>
+              </w:rPr>
+              <w:t>هدف الربح الأول.</w:t>
+            </w:r>
+          </w:p>
+        </w:tc>
+        <w:tc>
+          <w:tcPr>
+            <w:tcW w:type="dxa" w:w="4320"/>
+          </w:tcPr>
+          <w:p>
+            <w:pPr>
+              <w:jc w:val="left"/>
+            </w:pPr>
+            <w:r>
+              <w:rPr>
+                <w:rFonts w:ascii="Consolas" w:hAnsi="Consolas"/>
+                <w:b/>
+                <w:sz w:val="20"/>
+              </w:rPr>
+              <w:t>TP1 29533.67</w:t>
+            </w:r>
+          </w:p>
+        </w:tc>
+      </w:tr>
+      <w:tr>
+        <w:tc>
+          <w:tcPr>
+            <w:tcW w:type="dxa" w:w="4320"/>
+          </w:tcPr>
+          <w:p>
+            <w:pPr>
+              <w:bidi/>
+              <w:jc w:val="right"/>
+            </w:pPr>
+            <w:r>
+              <w:rPr>
+                <w:rFonts w:ascii="Arial" w:hAnsi="Arial"/>
+                <w:rtl/>
+              </w:rPr>
+              <w:t>أغلق نصف الصفقة عند هذا الهدف.</w:t>
+            </w:r>
+          </w:p>
+        </w:tc>
+        <w:tc>
+          <w:tcPr>
+            <w:tcW w:type="dxa" w:w="4320"/>
+          </w:tcPr>
+          <w:p>
+            <w:pPr>
+              <w:jc w:val="left"/>
+            </w:pPr>
+            <w:r>
+              <w:rPr>
+                <w:rFonts w:ascii="Consolas" w:hAnsi="Consolas"/>
+                <w:b/>
+                <w:sz w:val="20"/>
+              </w:rPr>
+              <w:t>50%</w:t>
+            </w:r>
+          </w:p>
+        </w:tc>
+      </w:tr>
+      <w:tr>
+        <w:tc>
+          <w:tcPr>
+            <w:tcW w:type="dxa" w:w="4320"/>
+          </w:tcPr>
+          <w:p>
+            <w:pPr>
+              <w:bidi/>
+              <w:jc w:val="right"/>
+            </w:pPr>
+            <w:r>
+              <w:rPr>
+                <w:rFonts w:ascii="Arial" w:hAnsi="Arial"/>
+                <w:rtl/>
+              </w:rPr>
+              <w:t>انقل الوقف إلى نقطة التعادل (سعر الدخول) بعد TP1 → بلا خسارة.</w:t>
+            </w:r>
+          </w:p>
+        </w:tc>
+        <w:tc>
+          <w:tcPr>
+            <w:tcW w:type="dxa" w:w="4320"/>
+          </w:tcPr>
+          <w:p>
+            <w:pPr>
+              <w:jc w:val="left"/>
+            </w:pPr>
+            <w:r>
+              <w:rPr>
+                <w:rFonts w:ascii="Consolas" w:hAnsi="Consolas"/>
+                <w:b/>
+                <w:sz w:val="20"/>
+              </w:rPr>
+              <w:t>move stop to BE</w:t>
+            </w:r>
+          </w:p>
+        </w:tc>
+      </w:tr>
+      <w:tr>
+        <w:tc>
+          <w:tcPr>
+            <w:tcW w:type="dxa" w:w="4320"/>
+          </w:tcPr>
+          <w:p>
+            <w:pPr>
+              <w:bidi/>
+              <w:jc w:val="right"/>
+            </w:pPr>
+            <w:r>
+              <w:rPr>
+                <w:rFonts w:ascii="Arial" w:hAnsi="Arial"/>
+                <w:rtl/>
+              </w:rPr>
+              <w:t>هدف الربح الثاني للنصف المتبقي.</w:t>
+            </w:r>
+          </w:p>
+        </w:tc>
+        <w:tc>
+          <w:tcPr>
+            <w:tcW w:type="dxa" w:w="4320"/>
+          </w:tcPr>
+          <w:p>
+            <w:pPr>
+              <w:jc w:val="left"/>
+            </w:pPr>
+            <w:r>
+              <w:rPr>
+                <w:rFonts w:ascii="Consolas" w:hAnsi="Consolas"/>
+                <w:b/>
+                <w:sz w:val="20"/>
+              </w:rPr>
+              <w:t>TP2 29651.41</w:t>
+            </w:r>
+          </w:p>
+        </w:tc>
+      </w:tr>
+      <w:tr>
+        <w:tc>
+          <w:tcPr>
+            <w:tcW w:type="dxa" w:w="4320"/>
+          </w:tcPr>
+          <w:p>
+            <w:pPr>
+              <w:bidi/>
+              <w:jc w:val="right"/>
+            </w:pPr>
+            <w:r>
+              <w:rPr>
+                <w:rFonts w:ascii="Arial" w:hAnsi="Arial"/>
+                <w:rtl/>
+              </w:rPr>
+              <w:t>وقف متحرّك بطريقة الثُريّا على مسافة 2.5× ATR يتبع السعر.</w:t>
+            </w:r>
+          </w:p>
+        </w:tc>
+        <w:tc>
+          <w:tcPr>
+            <w:tcW w:type="dxa" w:w="4320"/>
+          </w:tcPr>
+          <w:p>
+            <w:pPr>
+              <w:jc w:val="left"/>
+            </w:pPr>
+            <w:r>
+              <w:rPr>
+                <w:rFonts w:ascii="Consolas" w:hAnsi="Consolas"/>
+                <w:b/>
+                <w:sz w:val="20"/>
+              </w:rPr>
+              <w:t>trail: Chandelier 2.5x ATR</w:t>
+            </w:r>
+          </w:p>
+        </w:tc>
+      </w:tr>
+      <w:tr>
+        <w:tc>
+          <w:tcPr>
+            <w:tcW w:type="dxa" w:w="4320"/>
+          </w:tcPr>
+          <w:p>
+            <w:pPr>
+              <w:bidi/>
+              <w:jc w:val="right"/>
+            </w:pPr>
+            <w:r>
+              <w:rPr>
+                <w:rFonts w:ascii="Arial" w:hAnsi="Arial"/>
+                <w:rtl/>
+              </w:rPr>
+              <w:t>وقف زمني: إن لم تتحرك الصفقة بحلول هذا الوقت أغلقها.</w:t>
+            </w:r>
+          </w:p>
+        </w:tc>
+        <w:tc>
+          <w:tcPr>
+            <w:tcW w:type="dxa" w:w="4320"/>
+          </w:tcPr>
+          <w:p>
+            <w:pPr>
+              <w:jc w:val="left"/>
+            </w:pPr>
+            <w:r>
+              <w:rPr>
+                <w:rFonts w:ascii="Consolas" w:hAnsi="Consolas"/>
+                <w:b/>
+                <w:sz w:val="20"/>
+              </w:rPr>
+              <w:t>Time: If flat after 18:38 UTC</w:t>
+            </w:r>
+          </w:p>
+        </w:tc>
+      </w:tr>
+      <w:tr>
+        <w:tc>
+          <w:tcPr>
+            <w:tcW w:type="dxa" w:w="4320"/>
+          </w:tcPr>
+          <w:p>
+            <w:pPr>
+              <w:bidi/>
+              <w:jc w:val="right"/>
+            </w:pPr>
+            <w:r>
+              <w:rPr>
+                <w:rFonts w:ascii="Arial" w:hAnsi="Arial"/>
+                <w:rtl/>
+              </w:rPr>
+              <w:t>نفس الوقت بتوقيت دبي.</w:t>
+            </w:r>
+          </w:p>
+        </w:tc>
+        <w:tc>
+          <w:tcPr>
+            <w:tcW w:type="dxa" w:w="4320"/>
+          </w:tcPr>
+          <w:p>
+            <w:pPr>
+              <w:jc w:val="left"/>
+            </w:pPr>
+            <w:r>
+              <w:rPr>
+                <w:rFonts w:ascii="Consolas" w:hAnsi="Consolas"/>
+                <w:b/>
+                <w:sz w:val="20"/>
+              </w:rPr>
+              <w:t>(22:38 Dubai)</w:t>
+            </w:r>
+          </w:p>
+        </w:tc>
+      </w:tr>
+    </w:tbl>
+    <w:p>
+      <w:pPr>
+        <w:bidi/>
+        <w:jc w:val="right"/>
+      </w:pPr>
+      <w:r>
+        <w:rPr>
+          <w:rFonts w:ascii="Arial" w:hAnsi="Arial"/>
+          <w:b/>
+          <w:sz w:val="24"/>
+          <w:rtl/>
+        </w:rPr>
+        <w:t>الحجم والإغلاق:</w:t>
+      </w:r>
+    </w:p>
+    <w:tbl>
+      <w:tblPr>
+        <w:tblStyle w:val="LightGrid-Accent1"/>
+        <w:tblW w:type="auto" w:w="0"/>
+        <w:jc w:val="right"/>
+        <w:tblLook w:firstColumn="1" w:firstRow="1" w:lastColumn="0" w:lastRow="0" w:noHBand="0" w:noVBand="1" w:val="04A0"/>
+      </w:tblPr>
+      <w:tblGrid>
+        <w:gridCol w:w="4320"/>
+        <w:gridCol w:w="4320"/>
+      </w:tblGrid>
+      <w:tr>
+        <w:tc>
+          <w:tcPr>
+            <w:tcW w:type="dxa" w:w="4320"/>
+          </w:tcPr>
+          <w:p>
+            <w:pPr>
+              <w:bidi/>
+              <w:jc w:val="right"/>
+            </w:pPr>
+            <w:r>
+              <w:rPr>
+                <w:rFonts w:ascii="Arial" w:hAnsi="Arial"/>
+                <w:b/>
+                <w:rtl/>
+              </w:rPr>
+              <w:t>المعنى</w:t>
+            </w:r>
+          </w:p>
+        </w:tc>
+        <w:tc>
+          <w:tcPr>
+            <w:tcW w:type="dxa" w:w="4320"/>
+          </w:tcPr>
+          <w:p>
+            <w:pPr>
+              <w:bidi/>
+              <w:jc w:val="right"/>
+            </w:pPr>
+            <w:r>
+              <w:rPr>
+                <w:rFonts w:ascii="Arial" w:hAnsi="Arial"/>
+                <w:b/>
+                <w:rtl/>
+              </w:rPr>
+              <w:t>الكلمة / الرقم</w:t>
+            </w:r>
+          </w:p>
+        </w:tc>
+      </w:tr>
+      <w:tr>
+        <w:tc>
+          <w:tcPr>
+            <w:tcW w:type="dxa" w:w="4320"/>
+          </w:tcPr>
+          <w:p>
+            <w:pPr>
+              <w:bidi/>
+              <w:jc w:val="right"/>
+            </w:pPr>
+            <w:r>
+              <w:rPr>
+                <w:rFonts w:ascii="Arial" w:hAnsi="Arial"/>
+                <w:rtl/>
+              </w:rPr>
+              <w:t>الحجم المحسوب = 0 عقد.</w:t>
+            </w:r>
+          </w:p>
+        </w:tc>
+        <w:tc>
+          <w:tcPr>
+            <w:tcW w:type="dxa" w:w="4320"/>
+          </w:tcPr>
+          <w:p>
+            <w:pPr>
+              <w:jc w:val="left"/>
+            </w:pPr>
+            <w:r>
+              <w:rPr>
+                <w:rFonts w:ascii="Consolas" w:hAnsi="Consolas"/>
+                <w:b/>
+                <w:sz w:val="20"/>
+              </w:rPr>
+              <w:t>Size: 0 lots</w:t>
+            </w:r>
+          </w:p>
+        </w:tc>
+      </w:tr>
+      <w:tr>
+        <w:tc>
+          <w:tcPr>
+            <w:tcW w:type="dxa" w:w="4320"/>
+          </w:tcPr>
+          <w:p>
+            <w:pPr>
+              <w:bidi/>
+              <w:jc w:val="right"/>
+            </w:pPr>
+            <w:r>
+              <w:rPr>
+                <w:rFonts w:ascii="Arial" w:hAnsi="Arial"/>
+                <w:rtl/>
+              </w:rPr>
+              <w:t>عقد واحد يخاطر بـ118$ وهو أكبر من ميزانية المخاطرة 50$ لكل صفقة.</w:t>
+            </w:r>
+          </w:p>
+        </w:tc>
+        <w:tc>
+          <w:tcPr>
+            <w:tcW w:type="dxa" w:w="4320"/>
+          </w:tcPr>
+          <w:p>
+            <w:pPr>
+              <w:jc w:val="left"/>
+            </w:pPr>
+            <w:r>
+              <w:rPr>
+                <w:rFonts w:ascii="Consolas" w:hAnsi="Consolas"/>
+                <w:b/>
+                <w:sz w:val="20"/>
+              </w:rPr>
+              <w:t>1 lot risks $118 &gt; $50 budget</w:t>
+            </w:r>
+          </w:p>
+        </w:tc>
+      </w:tr>
+      <w:tr>
+        <w:tc>
+          <w:tcPr>
+            <w:tcW w:type="dxa" w:w="4320"/>
+          </w:tcPr>
+          <w:p>
+            <w:pPr>
+              <w:bidi/>
+              <w:jc w:val="right"/>
+            </w:pPr>
+            <w:r>
+              <w:rPr>
+                <w:rFonts w:ascii="Arial" w:hAnsi="Arial"/>
+                <w:rtl/>
+              </w:rPr>
+              <w:t>الحل: تجاهل الصفقة أو اسمح بعقود مصغّرة 0.01.</w:t>
+            </w:r>
+          </w:p>
+        </w:tc>
+        <w:tc>
+          <w:tcPr>
+            <w:tcW w:type="dxa" w:w="4320"/>
+          </w:tcPr>
+          <w:p>
+            <w:pPr>
+              <w:jc w:val="left"/>
+            </w:pPr>
+            <w:r>
+              <w:rPr>
+                <w:rFonts w:ascii="Consolas" w:hAnsi="Consolas"/>
+                <w:b/>
+                <w:sz w:val="20"/>
+              </w:rPr>
+              <w:t>SKIP or set MIN_LOT_SIZE=0.01</w:t>
+            </w:r>
+          </w:p>
+        </w:tc>
+      </w:tr>
+      <w:tr>
+        <w:tc>
+          <w:tcPr>
+            <w:tcW w:type="dxa" w:w="4320"/>
+          </w:tcPr>
+          <w:p>
+            <w:pPr>
+              <w:bidi/>
+              <w:jc w:val="right"/>
+            </w:pPr>
+            <w:r>
+              <w:rPr>
+                <w:rFonts w:ascii="Arial" w:hAnsi="Arial"/>
+                <w:rtl/>
+              </w:rPr>
+              <w:t>آخر موعد لإغلاق الصفقة نهائياً (بتوقيت UTC ودبي).</w:t>
+            </w:r>
+          </w:p>
+        </w:tc>
+        <w:tc>
+          <w:tcPr>
+            <w:tcW w:type="dxa" w:w="4320"/>
+          </w:tcPr>
+          <w:p>
+            <w:pPr>
+              <w:jc w:val="left"/>
+            </w:pPr>
+            <w:r>
+              <w:rPr>
+                <w:rFonts w:ascii="Consolas" w:hAnsi="Consolas"/>
+                <w:b/>
+                <w:sz w:val="20"/>
+              </w:rPr>
+              <w:t>FLAT BY 19:38 UTC</w:t>
+            </w:r>
+          </w:p>
+        </w:tc>
+      </w:tr>
+    </w:tbl>
+    <w:p>
+      <w:pPr>
+        <w:bidi/>
+        <w:jc w:val="right"/>
+      </w:pPr>
+      <w:r>
+        <w:rPr>
+          <w:rFonts w:ascii="Arial" w:hAnsi="Arial"/>
+          <w:b/>
+          <w:sz w:val="24"/>
+          <w:rtl/>
+        </w:rPr>
+        <w:t>سبب الإشارة (Why):</w:t>
+      </w:r>
+    </w:p>
+    <w:tbl>
+      <w:tblPr>
+        <w:tblStyle w:val="LightGrid-Accent1"/>
+        <w:tblW w:type="auto" w:w="0"/>
+        <w:jc w:val="right"/>
+        <w:tblLook w:firstColumn="1" w:firstRow="1" w:lastColumn="0" w:lastRow="0" w:noHBand="0" w:noVBand="1" w:val="04A0"/>
+      </w:tblPr>
+      <w:tblGrid>
+        <w:gridCol w:w="4320"/>
+        <w:gridCol w:w="4320"/>
+      </w:tblGrid>
+      <w:tr>
+        <w:tc>
+          <w:tcPr>
+            <w:tcW w:type="dxa" w:w="4320"/>
+          </w:tcPr>
+          <w:p>
+            <w:pPr>
+              <w:bidi/>
+              <w:jc w:val="right"/>
+            </w:pPr>
+            <w:r>
+              <w:rPr>
+                <w:rFonts w:ascii="Arial" w:hAnsi="Arial"/>
+                <w:b/>
+                <w:rtl/>
+              </w:rPr>
+              <w:t>المعنى</w:t>
+            </w:r>
+          </w:p>
+        </w:tc>
+        <w:tc>
+          <w:tcPr>
+            <w:tcW w:type="dxa" w:w="4320"/>
+          </w:tcPr>
+          <w:p>
+            <w:pPr>
+              <w:bidi/>
+              <w:jc w:val="right"/>
+            </w:pPr>
+            <w:r>
+              <w:rPr>
+                <w:rFonts w:ascii="Arial" w:hAnsi="Arial"/>
+                <w:b/>
+                <w:rtl/>
+              </w:rPr>
+              <w:t>الكلمة / الرقم</w:t>
+            </w:r>
+          </w:p>
+        </w:tc>
+      </w:tr>
+      <w:tr>
+        <w:tc>
+          <w:tcPr>
+            <w:tcW w:type="dxa" w:w="4320"/>
+          </w:tcPr>
+          <w:p>
+            <w:pPr>
+              <w:bidi/>
+              <w:jc w:val="right"/>
+            </w:pPr>
+            <w:r>
+              <w:rPr>
+                <w:rFonts w:ascii="Arial" w:hAnsi="Arial"/>
+                <w:rtl/>
+              </w:rPr>
+              <w:t>السعر ارتدّ من منطقة طلب/دعم على فريم الساعة بين هذين السعرين.</w:t>
+            </w:r>
+          </w:p>
+        </w:tc>
+        <w:tc>
+          <w:tcPr>
+            <w:tcW w:type="dxa" w:w="4320"/>
+          </w:tcPr>
+          <w:p>
+            <w:pPr>
+              <w:jc w:val="left"/>
+            </w:pPr>
+            <w:r>
+              <w:rPr>
+                <w:rFonts w:ascii="Consolas" w:hAnsi="Consolas"/>
+                <w:b/>
+                <w:sz w:val="20"/>
+              </w:rPr>
+              <w:t>rejected H1 demand zone 29206-29325</w:t>
+            </w:r>
+          </w:p>
+        </w:tc>
+      </w:tr>
+      <w:tr>
+        <w:tc>
+          <w:tcPr>
+            <w:tcW w:type="dxa" w:w="4320"/>
+          </w:tcPr>
+          <w:p>
+            <w:pPr>
+              <w:bidi/>
+              <w:jc w:val="right"/>
+            </w:pPr>
+            <w:r>
+              <w:rPr>
+                <w:rFonts w:ascii="Arial" w:hAnsi="Arial"/>
+                <w:rtl/>
+              </w:rPr>
+              <w:t>المؤشرات الثلاثة متوافقة كلها (3 من 3) — أقوى تأكيد.</w:t>
+            </w:r>
+          </w:p>
+        </w:tc>
+        <w:tc>
+          <w:tcPr>
+            <w:tcW w:type="dxa" w:w="4320"/>
+          </w:tcPr>
+          <w:p>
+            <w:pPr>
+              <w:jc w:val="left"/>
+            </w:pPr>
+            <w:r>
+              <w:rPr>
+                <w:rFonts w:ascii="Consolas" w:hAnsi="Consolas"/>
+                <w:b/>
+                <w:sz w:val="20"/>
+              </w:rPr>
+              <w:t>indicators aligned (3/3)</w:t>
+            </w:r>
+          </w:p>
+        </w:tc>
+      </w:tr>
+      <w:tr>
+        <w:tc>
+          <w:tcPr>
+            <w:tcW w:type="dxa" w:w="4320"/>
+          </w:tcPr>
+          <w:p>
+            <w:pPr>
+              <w:bidi/>
+              <w:jc w:val="right"/>
+            </w:pPr>
+            <w:r>
+              <w:rPr>
+                <w:rFonts w:ascii="Arial" w:hAnsi="Arial"/>
+                <w:rtl/>
+              </w:rPr>
+              <w:t>مؤشر القوة النسبية صاعد عند 61 (زخم شرائي، فوق 50).</w:t>
+            </w:r>
+          </w:p>
+        </w:tc>
+        <w:tc>
+          <w:tcPr>
+            <w:tcW w:type="dxa" w:w="4320"/>
+          </w:tcPr>
+          <w:p>
+            <w:pPr>
+              <w:jc w:val="left"/>
+            </w:pPr>
+            <w:r>
+              <w:rPr>
+                <w:rFonts w:ascii="Consolas" w:hAnsi="Consolas"/>
+                <w:b/>
+                <w:sz w:val="20"/>
+              </w:rPr>
+              <w:t>RSI 61</w:t>
+            </w:r>
+          </w:p>
+        </w:tc>
+      </w:tr>
+      <w:tr>
+        <w:tc>
+          <w:tcPr>
+            <w:tcW w:type="dxa" w:w="4320"/>
+          </w:tcPr>
+          <w:p>
+            <w:pPr>
+              <w:bidi/>
+              <w:jc w:val="right"/>
+            </w:pPr>
+            <w:r>
+              <w:rPr>
+                <w:rFonts w:ascii="Arial" w:hAnsi="Arial"/>
+                <w:rtl/>
+              </w:rPr>
+              <w:t>مؤشر الماكد صاعد (زخم إيجابي).</w:t>
+            </w:r>
+          </w:p>
+        </w:tc>
+        <w:tc>
+          <w:tcPr>
+            <w:tcW w:type="dxa" w:w="4320"/>
+          </w:tcPr>
+          <w:p>
+            <w:pPr>
+              <w:jc w:val="left"/>
+            </w:pPr>
+            <w:r>
+              <w:rPr>
+                <w:rFonts w:ascii="Consolas" w:hAnsi="Consolas"/>
+                <w:b/>
+                <w:sz w:val="20"/>
+              </w:rPr>
+              <w:t>MACD up</w:t>
+            </w:r>
+          </w:p>
+        </w:tc>
+      </w:tr>
+      <w:tr>
+        <w:tc>
+          <w:tcPr>
+            <w:tcW w:type="dxa" w:w="4320"/>
+          </w:tcPr>
+          <w:p>
+            <w:pPr>
+              <w:bidi/>
+              <w:jc w:val="right"/>
+            </w:pPr>
+            <w:r>
+              <w:rPr>
+                <w:rFonts w:ascii="Arial" w:hAnsi="Arial"/>
+                <w:rtl/>
+              </w:rPr>
+              <w:t>السعر فوق المتوسط المتحرك الأسّي 20 (اتجاه صاعد).</w:t>
+            </w:r>
+          </w:p>
+        </w:tc>
+        <w:tc>
+          <w:tcPr>
+            <w:tcW w:type="dxa" w:w="4320"/>
+          </w:tcPr>
+          <w:p>
+            <w:pPr>
+              <w:jc w:val="left"/>
+            </w:pPr>
+            <w:r>
+              <w:rPr>
+                <w:rFonts w:ascii="Consolas" w:hAnsi="Consolas"/>
+                <w:b/>
+                <w:sz w:val="20"/>
+              </w:rPr>
+              <w:t>&gt;EMA20</w:t>
+            </w:r>
+          </w:p>
+        </w:tc>
+      </w:tr>
+      <w:tr>
+        <w:tc>
+          <w:tcPr>
+            <w:tcW w:type="dxa" w:w="4320"/>
+          </w:tcPr>
+          <w:p>
+            <w:pPr>
+              <w:bidi/>
+              <w:jc w:val="right"/>
+            </w:pPr>
+            <w:r>
+              <w:rPr>
+                <w:rFonts w:ascii="Arial" w:hAnsi="Arial"/>
+                <w:rtl/>
+              </w:rPr>
+              <w:t>الاتجاه على الفريم الأكبر صاعد ومتوافق مع الصفقة.</w:t>
+            </w:r>
+          </w:p>
+        </w:tc>
+        <w:tc>
+          <w:tcPr>
+            <w:tcW w:type="dxa" w:w="4320"/>
+          </w:tcPr>
+          <w:p>
+            <w:pPr>
+              <w:jc w:val="left"/>
+            </w:pPr>
+            <w:r>
+              <w:rPr>
+                <w:rFonts w:ascii="Consolas" w:hAnsi="Consolas"/>
+                <w:b/>
+                <w:sz w:val="20"/>
+              </w:rPr>
+              <w:t>HTF bias bull aligned</w:t>
+            </w:r>
+          </w:p>
+        </w:tc>
+      </w:tr>
+      <w:tr>
+        <w:tc>
+          <w:tcPr>
+            <w:tcW w:type="dxa" w:w="4320"/>
+          </w:tcPr>
+          <w:p>
+            <w:pPr>
+              <w:bidi/>
+              <w:jc w:val="right"/>
+            </w:pPr>
+            <w:r>
+              <w:rPr>
+                <w:rFonts w:ascii="Arial" w:hAnsi="Arial"/>
+                <w:rtl/>
+              </w:rPr>
+              <w:t>الإشارة ظهرت في جلسة نيويورك (أقوى جلسة، تعطي بونص).</w:t>
+            </w:r>
+          </w:p>
+        </w:tc>
+        <w:tc>
+          <w:tcPr>
+            <w:tcW w:type="dxa" w:w="4320"/>
+          </w:tcPr>
+          <w:p>
+            <w:pPr>
+              <w:jc w:val="left"/>
+            </w:pPr>
+            <w:r>
+              <w:rPr>
+                <w:rFonts w:ascii="Consolas" w:hAnsi="Consolas"/>
+                <w:b/>
+                <w:sz w:val="20"/>
+              </w:rPr>
+              <w:t>NY session</w:t>
+            </w:r>
+          </w:p>
+        </w:tc>
+      </w:tr>
+    </w:tbl>
+    <w:p>
+      <w:pPr>
+        <w:bidi/>
+        <w:jc w:val="right"/>
+      </w:pPr>
+      <w:r>
+        <w:rPr>
+          <w:rFonts w:ascii="Arial" w:hAnsi="Arial"/>
+          <w:b/>
+          <w:sz w:val="24"/>
+          <w:rtl/>
+        </w:rPr>
+        <w:t>السطران الأخيران:</w:t>
+      </w:r>
+    </w:p>
+    <w:tbl>
+      <w:tblPr>
+        <w:tblStyle w:val="LightGrid-Accent1"/>
+        <w:tblW w:type="auto" w:w="0"/>
+        <w:jc w:val="right"/>
+        <w:tblLook w:firstColumn="1" w:firstRow="1" w:lastColumn="0" w:lastRow="0" w:noHBand="0" w:noVBand="1" w:val="04A0"/>
+      </w:tblPr>
+      <w:tblGrid>
+        <w:gridCol w:w="4320"/>
+        <w:gridCol w:w="4320"/>
+      </w:tblGrid>
+      <w:tr>
+        <w:tc>
+          <w:tcPr>
+            <w:tcW w:type="dxa" w:w="4320"/>
+          </w:tcPr>
+          <w:p>
+            <w:pPr>
+              <w:bidi/>
+              <w:jc w:val="right"/>
+            </w:pPr>
+            <w:r>
+              <w:rPr>
+                <w:rFonts w:ascii="Arial" w:hAnsi="Arial"/>
+                <w:b/>
+                <w:rtl/>
+              </w:rPr>
+              <w:t>المعنى</w:t>
+            </w:r>
+          </w:p>
+        </w:tc>
+        <w:tc>
+          <w:tcPr>
+            <w:tcW w:type="dxa" w:w="4320"/>
+          </w:tcPr>
+          <w:p>
+            <w:pPr>
+              <w:bidi/>
+              <w:jc w:val="right"/>
+            </w:pPr>
+            <w:r>
+              <w:rPr>
+                <w:rFonts w:ascii="Arial" w:hAnsi="Arial"/>
+                <w:b/>
+                <w:rtl/>
+              </w:rPr>
+              <w:t>الكلمة / الرقم</w:t>
+            </w:r>
+          </w:p>
+        </w:tc>
+      </w:tr>
+      <w:tr>
+        <w:tc>
+          <w:tcPr>
+            <w:tcW w:type="dxa" w:w="4320"/>
+          </w:tcPr>
+          <w:p>
+            <w:pPr>
+              <w:bidi/>
+              <w:jc w:val="right"/>
+            </w:pPr>
+            <w:r>
+              <w:rPr>
+                <w:rFonts w:ascii="Arial" w:hAnsi="Arial"/>
+                <w:rtl/>
+              </w:rPr>
+              <w:t>فلسفة المخاطر: البقاء أهم من رأس المال، ورأس المال أهم من النمو.</w:t>
+            </w:r>
+          </w:p>
+        </w:tc>
+        <w:tc>
+          <w:tcPr>
+            <w:tcW w:type="dxa" w:w="4320"/>
+          </w:tcPr>
+          <w:p>
+            <w:pPr>
+              <w:jc w:val="left"/>
+            </w:pPr>
+            <w:r>
+              <w:rPr>
+                <w:rFonts w:ascii="Consolas" w:hAnsi="Consolas"/>
+                <w:b/>
+                <w:sz w:val="20"/>
+              </w:rPr>
+              <w:t>Survival &gt; Capital &gt; Growth</w:t>
+            </w:r>
+          </w:p>
+        </w:tc>
+      </w:tr>
+      <w:tr>
+        <w:tc>
+          <w:tcPr>
+            <w:tcW w:type="dxa" w:w="4320"/>
+          </w:tcPr>
+          <w:p>
+            <w:pPr>
+              <w:bidi/>
+              <w:jc w:val="right"/>
+            </w:pPr>
+            <w:r>
+              <w:rPr>
+                <w:rFonts w:ascii="Arial" w:hAnsi="Arial"/>
+                <w:rtl/>
+              </w:rPr>
+              <w:t>سجّل النتيجة (W ربح / L خسارة) في ملف السجل لتحسين الإحصائيات.</w:t>
+            </w:r>
+          </w:p>
+        </w:tc>
+        <w:tc>
+          <w:tcPr>
+            <w:tcW w:type="dxa" w:w="4320"/>
+          </w:tcPr>
+          <w:p>
+            <w:pPr>
+              <w:jc w:val="left"/>
+            </w:pPr>
+            <w:r>
+              <w:rPr>
+                <w:rFonts w:ascii="Consolas" w:hAnsi="Consolas"/>
+                <w:b/>
+                <w:sz w:val="20"/>
+              </w:rPr>
+              <w:t>Mark W/L in signals_log.csv</w:t>
+            </w:r>
+          </w:p>
+        </w:tc>
+      </w:tr>
+    </w:tbl>
+    <w:p>
+      <w:pPr>
+        <w:pStyle w:val="Heading2"/>
+        <w:bidi/>
+        <w:jc w:val="right"/>
+      </w:pPr>
+      <w:r>
+        <w:rPr>
+          <w:rFonts w:ascii="Arial" w:hAnsi="Arial"/>
+          <w:color w:val="1F4E79"/>
+          <w:rtl/>
+        </w:rPr>
+        <w:t>المثال الثاني — DOW (US30): الفروقات فقط</w:t>
+      </w:r>
+    </w:p>
+    <w:p>
+      <w:pPr>
+        <w:bidi/>
+        <w:jc w:val="right"/>
+      </w:pPr>
+      <w:r>
+        <w:rPr>
+          <w:rFonts w:ascii="Arial" w:hAnsi="Arial"/>
+          <w:b w:val="0"/>
+          <w:sz w:val="24"/>
+          <w:rtl/>
+        </w:rPr>
+        <w:t>نفس المعاني، مع اختلاف الأرقام والنقاط التالية المهمة:</w:t>
+      </w:r>
+    </w:p>
+    <w:tbl>
+      <w:tblPr>
+        <w:tblStyle w:val="LightGrid-Accent1"/>
+        <w:tblW w:type="auto" w:w="0"/>
+        <w:jc w:val="right"/>
+        <w:tblLook w:firstColumn="1" w:firstRow="1" w:lastColumn="0" w:lastRow="0" w:noHBand="0" w:noVBand="1" w:val="04A0"/>
+      </w:tblPr>
+      <w:tblGrid>
+        <w:gridCol w:w="4320"/>
+        <w:gridCol w:w="4320"/>
+      </w:tblGrid>
+      <w:tr>
+        <w:tc>
+          <w:tcPr>
+            <w:tcW w:type="dxa" w:w="4320"/>
+          </w:tcPr>
+          <w:p>
+            <w:pPr>
+              <w:bidi/>
+              <w:jc w:val="right"/>
+            </w:pPr>
+            <w:r>
+              <w:rPr>
+                <w:rFonts w:ascii="Arial" w:hAnsi="Arial"/>
+                <w:b/>
+                <w:rtl/>
+              </w:rPr>
+              <w:t>المعنى</w:t>
+            </w:r>
+          </w:p>
+        </w:tc>
+        <w:tc>
+          <w:tcPr>
+            <w:tcW w:type="dxa" w:w="4320"/>
+          </w:tcPr>
+          <w:p>
+            <w:pPr>
+              <w:bidi/>
+              <w:jc w:val="right"/>
+            </w:pPr>
+            <w:r>
+              <w:rPr>
+                <w:rFonts w:ascii="Arial" w:hAnsi="Arial"/>
+                <w:b/>
+                <w:rtl/>
+              </w:rPr>
+              <w:t>الكلمة / الرقم</w:t>
+            </w:r>
+          </w:p>
+        </w:tc>
+      </w:tr>
+      <w:tr>
+        <w:tc>
+          <w:tcPr>
+            <w:tcW w:type="dxa" w:w="4320"/>
+          </w:tcPr>
+          <w:p>
+            <w:pPr>
+              <w:bidi/>
+              <w:jc w:val="right"/>
+            </w:pPr>
+            <w:r>
+              <w:rPr>
+                <w:rFonts w:ascii="Arial" w:hAnsi="Arial"/>
+                <w:rtl/>
+              </w:rPr>
+              <w:t>أعلى من 75 — كان بقوة A+ من حيث التقييم، لكنه أُرسل WATCH (غالباً بسبب سقف إشارة مؤشر واحدة لكل دورة).</w:t>
+            </w:r>
+          </w:p>
+        </w:tc>
+        <w:tc>
+          <w:tcPr>
+            <w:tcW w:type="dxa" w:w="4320"/>
+          </w:tcPr>
+          <w:p>
+            <w:pPr>
+              <w:jc w:val="left"/>
+            </w:pPr>
+            <w:r>
+              <w:rPr>
+                <w:rFonts w:ascii="Consolas" w:hAnsi="Consolas"/>
+                <w:b/>
+                <w:sz w:val="20"/>
+              </w:rPr>
+              <w:t>score 76/100</w:t>
+            </w:r>
+          </w:p>
+        </w:tc>
+      </w:tr>
+      <w:tr>
+        <w:tc>
+          <w:tcPr>
+            <w:tcW w:type="dxa" w:w="4320"/>
+          </w:tcPr>
+          <w:p>
+            <w:pPr>
+              <w:bidi/>
+              <w:jc w:val="right"/>
+            </w:pPr>
+            <w:r>
+              <w:rPr>
+                <w:rFonts w:ascii="Arial" w:hAnsi="Arial"/>
+                <w:rtl/>
+              </w:rPr>
+              <w:t>وقف ضيّق جداً (0.6× فقط) — مخاطرة أصغر لكن احتمال ضربه أعلى.</w:t>
+            </w:r>
+          </w:p>
+        </w:tc>
+        <w:tc>
+          <w:tcPr>
+            <w:tcW w:type="dxa" w:w="4320"/>
+          </w:tcPr>
+          <w:p>
+            <w:pPr>
+              <w:jc w:val="left"/>
+            </w:pPr>
+            <w:r>
+              <w:rPr>
+                <w:rFonts w:ascii="Consolas" w:hAnsi="Consolas"/>
+                <w:b/>
+                <w:sz w:val="20"/>
+              </w:rPr>
+              <w:t>Stop 0.6x ATR15 (53.84pts)</w:t>
+            </w:r>
+          </w:p>
+        </w:tc>
+      </w:tr>
+      <w:tr>
+        <w:tc>
+          <w:tcPr>
+            <w:tcW w:type="dxa" w:w="4320"/>
+          </w:tcPr>
+          <w:p>
+            <w:pPr>
+              <w:bidi/>
+              <w:jc w:val="right"/>
+            </w:pPr>
+            <w:r>
+              <w:rPr>
+                <w:rFonts w:ascii="Arial" w:hAnsi="Arial"/>
+                <w:rtl/>
+              </w:rPr>
+              <w:t>تأكيد أضعف من ناسداك — RSI عند 45 فقط (محايد، تحت 50) رغم صعود الماكد وEMA.</w:t>
+            </w:r>
+          </w:p>
+        </w:tc>
+        <w:tc>
+          <w:tcPr>
+            <w:tcW w:type="dxa" w:w="4320"/>
+          </w:tcPr>
+          <w:p>
+            <w:pPr>
+              <w:jc w:val="left"/>
+            </w:pPr>
+            <w:r>
+              <w:rPr>
+                <w:rFonts w:ascii="Consolas" w:hAnsi="Consolas"/>
+                <w:b/>
+                <w:sz w:val="20"/>
+              </w:rPr>
+              <w:t>indicators aligned (2/3)</w:t>
+            </w:r>
+          </w:p>
+        </w:tc>
+      </w:tr>
+      <w:tr>
+        <w:tc>
+          <w:tcPr>
+            <w:tcW w:type="dxa" w:w="4320"/>
+          </w:tcPr>
+          <w:p>
+            <w:pPr>
+              <w:bidi/>
+              <w:jc w:val="right"/>
+            </w:pPr>
+            <w:r>
+              <w:rPr>
+                <w:rFonts w:ascii="Arial" w:hAnsi="Arial"/>
+                <w:rtl/>
+              </w:rPr>
+              <w:t>نفس المشكلة: عقد واحد (54$) يتجاوز ميزانية 50$ بقليل.</w:t>
+            </w:r>
+          </w:p>
+        </w:tc>
+        <w:tc>
+          <w:tcPr>
+            <w:tcW w:type="dxa" w:w="4320"/>
+          </w:tcPr>
+          <w:p>
+            <w:pPr>
+              <w:jc w:val="left"/>
+            </w:pPr>
+            <w:r>
+              <w:rPr>
+                <w:rFonts w:ascii="Consolas" w:hAnsi="Consolas"/>
+                <w:b/>
+                <w:sz w:val="20"/>
+              </w:rPr>
+              <w:t>Size: 0 lots — 1 lot risks $54</w:t>
+            </w:r>
+          </w:p>
+        </w:tc>
+      </w:tr>
+    </w:tbl>
+    <w:p>
+      <w:pPr>
+        <w:pStyle w:val="Heading2"/>
+        <w:bidi/>
+        <w:jc w:val="right"/>
+      </w:pPr>
+      <w:r>
+        <w:rPr>
+          <w:rFonts w:ascii="Arial" w:hAnsi="Arial"/>
+          <w:color w:val="1F4E79"/>
+          <w:rtl/>
+        </w:rPr>
+        <w:t>خلاصة سريعة</w:t>
+      </w:r>
+    </w:p>
+    <w:p>
+      <w:pPr>
+        <w:pStyle w:val="ListBullet"/>
+        <w:bidi/>
+        <w:jc w:val="right"/>
+      </w:pPr>
+      <w:r>
+        <w:rPr>
+          <w:rFonts w:ascii="Arial" w:hAnsi="Arial"/>
+          <w:b/>
+          <w:rtl/>
+        </w:rPr>
+        <w:t xml:space="preserve">WATCH = </w:t>
+      </w:r>
+      <w:r>
+        <w:rPr>
+          <w:rFonts w:ascii="Arial" w:hAnsi="Arial"/>
+          <w:rtl/>
+        </w:rPr>
+        <w:t>راقب فقط، لا تنفّذ آلياً.</w:t>
+      </w:r>
+    </w:p>
+    <w:p>
+      <w:pPr>
+        <w:pStyle w:val="ListBullet"/>
+        <w:bidi/>
+        <w:jc w:val="right"/>
+      </w:pPr>
+      <w:r>
+        <w:rPr>
+          <w:rFonts w:ascii="Arial" w:hAnsi="Arial"/>
+          <w:b/>
+          <w:rtl/>
+        </w:rPr>
+        <w:t xml:space="preserve">Size: 0 lots = </w:t>
+      </w:r>
+      <w:r>
+        <w:rPr>
+          <w:rFonts w:ascii="Arial" w:hAnsi="Arial"/>
+          <w:rtl/>
+        </w:rPr>
+        <w:t>البوت يخبرك أن صفقة بحجم عقد كامل تتجاوز حد مخاطرتك (50$). الحل: عقود مصغّرة 0.01 أو تجاهل.</w:t>
+      </w:r>
+    </w:p>
+    <w:p>
+      <w:pPr>
+        <w:pStyle w:val="ListBullet"/>
+        <w:bidi/>
+        <w:jc w:val="right"/>
+      </w:pPr>
+      <w:r>
+        <w:rPr>
+          <w:rFonts w:ascii="Arial" w:hAnsi="Arial"/>
+          <w:b/>
+          <w:rtl/>
+        </w:rPr>
+        <w:t xml:space="preserve">indicators X/3 = </w:t>
+      </w:r>
+      <w:r>
+        <w:rPr>
+          <w:rFonts w:ascii="Arial" w:hAnsi="Arial"/>
+          <w:rtl/>
+        </w:rPr>
+        <w:t>كلما زاد الرقم (3/3) كان التأكيد أقوى.</w:t>
+      </w:r>
+    </w:p>
+    <w:p>
+      <w:pPr>
+        <w:pStyle w:val="ListBullet"/>
+        <w:bidi/>
+        <w:jc w:val="right"/>
+      </w:pPr>
+      <w:r>
+        <w:rPr>
+          <w:rFonts w:ascii="Arial" w:hAnsi="Arial"/>
+          <w:b/>
+          <w:rtl/>
+        </w:rPr>
+        <w:t xml:space="preserve">ATR multiplier = </w:t>
+      </w:r>
+      <w:r>
+        <w:rPr>
+          <w:rFonts w:ascii="Arial" w:hAnsi="Arial"/>
+          <w:rtl/>
+        </w:rPr>
+        <w:t>يخبرك كم الوقف واسع مقابل تقلّب السوق (أصغر = أضيق وأقرب).</w:t>
+      </w:r>
+    </w:p>
     <w:sectPr>
       <w:pgSz w:w="12240" w:h="15840"/>
       <w:pgMar w:top="1440" w:right="1800" w:bottom="1440" w:left="1800" w:header="720" w:footer="720" w:gutter="0"/>

</xml_diff>